<commit_message>
testing source control with LookFast_Issue_Log
</commit_message>
<xml_diff>
--- a/opencsp/app/lookback/LookFast_Issue_Log.docx
+++ b/opencsp/app/lookback/LookFast_Issue_Log.docx
@@ -3,8 +3,13 @@
 <w:document xmlns:wpc="http://schemas.microsoft.com/office/word/2010/wordprocessingCanvas" xmlns:cx="http://schemas.microsoft.com/office/drawing/2014/chartex" xmlns:cx1="http://schemas.microsoft.com/office/drawing/2015/9/8/chartex" xmlns:cx2="http://schemas.microsoft.com/office/drawing/2015/10/21/chartex" xmlns:cx3="http://schemas.microsoft.com/office/drawing/2016/5/9/chartex" xmlns:cx4="http://schemas.microsoft.com/office/drawing/2016/5/10/chartex" xmlns:cx5="http://schemas.microsoft.com/office/drawing/2016/5/11/chartex" xmlns:cx6="http://schemas.microsoft.com/office/drawing/2016/5/12/chartex" xmlns:cx7="http://schemas.microsoft.com/office/drawing/2016/5/13/chartex" xmlns:cx8="http://schemas.microsoft.com/office/drawing/2016/5/14/chartex" xmlns:mc="http://schemas.openxmlformats.org/markup-compatibility/2006" xmlns:aink="http://schemas.microsoft.com/office/drawing/2016/ink" xmlns:am3d="http://schemas.microsoft.com/office/drawing/2017/model3d" xmlns:o="urn:schemas-microsoft-com:office:office" xmlns:oel="http://schemas.microsoft.com/office/2019/extlst" xmlns:r="http://schemas.openxmlformats.org/officeDocument/2006/relationships" xmlns:m="http://schemas.openxmlformats.org/officeDocument/2006/math" xmlns:v="urn:schemas-microsoft-com:vml" xmlns:wp14="http://schemas.microsoft.com/office/word/2010/wordprocessingDrawing" xmlns:wp="http://schemas.openxmlformats.org/drawingml/2006/wordprocessingDrawing" xmlns:w10="urn:schemas-microsoft-com:office:word" xmlns:w="http://schemas.openxmlformats.org/wordprocessingml/2006/main" xmlns:w14="http://schemas.microsoft.com/office/word/2010/wordml" xmlns:w15="http://schemas.microsoft.com/office/word/2012/wordml" xmlns:w16cex="http://schemas.microsoft.com/office/word/2018/wordml/cex" xmlns:w16cid="http://schemas.microsoft.com/office/word/2016/wordml/cid" xmlns:w16="http://schemas.microsoft.com/office/word/2018/wordml" xmlns:w16du="http://schemas.microsoft.com/office/word/2023/wordml/word16du" xmlns:w16sdtdh="http://schemas.microsoft.com/office/word/2020/wordml/sdtdatahash" xmlns:w16sdtfl="http://schemas.microsoft.com/office/word/2024/wordml/sdtformatlock" xmlns:w16se="http://schemas.microsoft.com/office/word/2015/wordml/symex" xmlns:wpg="http://schemas.microsoft.com/office/word/2010/wordprocessingGroup" xmlns:wpi="http://schemas.microsoft.com/office/word/2010/wordprocessingInk" xmlns:wne="http://schemas.microsoft.com/office/word/2006/wordml" xmlns:wps="http://schemas.microsoft.com/office/word/2010/wordprocessingShape" mc:Ignorable="w14 w15 w16se w16cid w16 w16cex w16sdtdh w16sdtfl w16du wp14">
   <w:body>
     <w:p>
+      <w:proofErr w:type="spellStart"/>
       <w:r>
-        <w:t>LookFast Issue Log</w:t>
+        <w:t>LookFast</w:t>
+      </w:r>
+      <w:proofErr w:type="spellEnd"/>
+      <w:r>
+        <w:t xml:space="preserve"> Issue Log</w:t>
       </w:r>
       <w:r>
         <w:t xml:space="preserve"> / TODO List</w:t>
@@ -31,7 +36,15 @@
         </w:numPr>
       </w:pPr>
       <w:r>
-        <w:t>Decision for final transform alignment to format for Sofast Back End needs to be automated. Control points implemented and checked is working idea.</w:t>
+        <w:t xml:space="preserve">Decision for final transform alignment to format for </w:t>
+      </w:r>
+      <w:proofErr w:type="spellStart"/>
+      <w:r>
+        <w:t>Sofast</w:t>
+      </w:r>
+      <w:proofErr w:type="spellEnd"/>
+      <w:r>
+        <w:t xml:space="preserve"> Back End needs to be automated. Control points implemented and checked is working idea.</w:t>
       </w:r>
     </w:p>
     <w:p>
@@ -43,8 +56,37 @@
         </w:numPr>
       </w:pPr>
       <w:r>
-        <w:t xml:space="preserve">Implement moon phase function so that LookFast can be performed on any clear lunar day with sufficient lighting. This would need a lot of additional code changes to calculate projected shape intercept locations, etc. </w:t>
+        <w:t xml:space="preserve">Implement moon phase function so that </w:t>
       </w:r>
+      <w:proofErr w:type="spellStart"/>
+      <w:r>
+        <w:t>LookFast</w:t>
+      </w:r>
+      <w:proofErr w:type="spellEnd"/>
+      <w:r>
+        <w:t xml:space="preserve"> can be performed on any clear lunar day with sufficient lighting. This would need a lot of additional code changes to calculate projected shape intercept locations, etc. </w:t>
+      </w:r>
+    </w:p>
+    <w:p>
+      <w:pPr>
+        <w:pStyle w:val="ListParagraph"/>
+        <w:numPr>
+          <w:ilvl w:val="0"/>
+          <w:numId w:val="1"/>
+        </w:numPr>
+      </w:pPr>
+      <w:r>
+        <w:t>Git trouble sync testing.</w:t>
+      </w:r>
+    </w:p>
+    <w:p>
+      <w:pPr>
+        <w:pStyle w:val="ListParagraph"/>
+        <w:numPr>
+          <w:ilvl w:val="0"/>
+          <w:numId w:val="1"/>
+        </w:numPr>
+      </w:pPr>
     </w:p>
     <w:sectPr>
       <w:pgSz w:w="12240" w:h="15840"/>

</xml_diff>

<commit_message>
renamed test files to tst so they will not fail pytest check before submitting pull request for LookFast. I also added plotting an statistics output for the pointing estimate. This is primed, but not fully integrated into the Lookfast_main_VCLI_argparse workflow. There are also some notes in the Lookfast issue log and minor name changes of files.
</commit_message>
<xml_diff>
--- a/opencsp/app/lookback/LookFast_Issue_Log.docx
+++ b/opencsp/app/lookback/LookFast_Issue_Log.docx
@@ -36,26 +36,6 @@
         </w:numPr>
       </w:pPr>
       <w:r>
-        <w:t xml:space="preserve">Decision for final transform alignment to format for </w:t>
-      </w:r>
-      <w:proofErr w:type="spellStart"/>
-      <w:r>
-        <w:t>Sofast</w:t>
-      </w:r>
-      <w:proofErr w:type="spellEnd"/>
-      <w:r>
-        <w:t xml:space="preserve"> Back End needs to be automated. Control points implemented and checked is working idea.</w:t>
-      </w:r>
-    </w:p>
-    <w:p>
-      <w:pPr>
-        <w:pStyle w:val="ListParagraph"/>
-        <w:numPr>
-          <w:ilvl w:val="0"/>
-          <w:numId w:val="1"/>
-        </w:numPr>
-      </w:pPr>
-      <w:r>
         <w:t xml:space="preserve">Implement moon phase function so that </w:t>
       </w:r>
       <w:proofErr w:type="spellStart"/>
@@ -76,17 +56,24 @@
         </w:numPr>
       </w:pPr>
       <w:r>
-        <w:t>Git trouble sync testing.</w:t>
+        <w:t xml:space="preserve">The </w:t>
       </w:r>
-    </w:p>
-    <w:p>
-      <w:pPr>
-        <w:pStyle w:val="ListParagraph"/>
-        <w:numPr>
-          <w:ilvl w:val="0"/>
-          <w:numId w:val="1"/>
-        </w:numPr>
-      </w:pPr>
+      <w:proofErr w:type="spellStart"/>
+      <w:r>
+        <w:t>Sofast</w:t>
+      </w:r>
+      <w:proofErr w:type="spellEnd"/>
+      <w:r>
+        <w:t xml:space="preserve"> backend plotting currently has hard coded values embedded in the “lookfast_camera_adjust_V2_module.py” file. This needs to be moved outside with its own configuration file. Need to check in the Alan or Randy to get the most up to date configuration procedure for </w:t>
+      </w:r>
+      <w:proofErr w:type="spellStart"/>
+      <w:r>
+        <w:t>Sofast</w:t>
+      </w:r>
+      <w:proofErr w:type="spellEnd"/>
+      <w:r>
+        <w:t xml:space="preserve"> plotting.</w:t>
+      </w:r>
     </w:p>
     <w:sectPr>
       <w:pgSz w:w="12240" w:h="15840"/>

</xml_diff>